<commit_message>
These are the documentations
</commit_message>
<xml_diff>
--- a/Documentations/Course E-registration system documentation(Software Engineering).docx
+++ b/Documentations/Course E-registration system documentation(Software Engineering).docx
@@ -1,6 +1,6 @@
 
 <file path=word/document.xml><?xml version="1.0" encoding="utf-8"?>
-<w:document xmlns:wpc="http://schemas.microsoft.com/office/word/2010/wordprocessingCanvas" xmlns:mc="http://schemas.openxmlformats.org/markup-compatibility/2006" xmlns:o="urn:schemas-microsoft-com:office:office" xmlns:r="http://schemas.openxmlformats.org/officeDocument/2006/relationships" xmlns:m="http://schemas.openxmlformats.org/officeDocument/2006/math" xmlns:v="urn:schemas-microsoft-com:vml" xmlns:wp14="http://schemas.microsoft.com/office/word/2010/wordprocessingDrawing" xmlns:wp="http://schemas.openxmlformats.org/drawingml/2006/wordprocessingDrawing" xmlns:w10="urn:schemas-microsoft-com:office:word" xmlns:w="http://schemas.openxmlformats.org/wordprocessingml/2006/main" xmlns:w14="http://schemas.microsoft.com/office/word/2010/wordml" xmlns:w15="http://schemas.microsoft.com/office/word/2012/wordml" xmlns:wpg="http://schemas.microsoft.com/office/word/2010/wordprocessingGroup" xmlns:wpi="http://schemas.microsoft.com/office/word/2010/wordprocessingInk" xmlns:wne="http://schemas.microsoft.com/office/word/2006/wordml" xmlns:wps="http://schemas.microsoft.com/office/word/2010/wordprocessingShape" mc:Ignorable="w14 w15 wp14">
+<w:document xmlns:wpc="http://schemas.microsoft.com/office/word/2010/wordprocessingCanvas" xmlns:cx="http://schemas.microsoft.com/office/drawing/2014/chartex" xmlns:cx1="http://schemas.microsoft.com/office/drawing/2015/9/8/chartex" xmlns:cx2="http://schemas.microsoft.com/office/drawing/2015/10/21/chartex" xmlns:cx3="http://schemas.microsoft.com/office/drawing/2016/5/9/chartex" xmlns:cx4="http://schemas.microsoft.com/office/drawing/2016/5/10/chartex" xmlns:cx5="http://schemas.microsoft.com/office/drawing/2016/5/11/chartex" xmlns:cx6="http://schemas.microsoft.com/office/drawing/2016/5/12/chartex" xmlns:cx7="http://schemas.microsoft.com/office/drawing/2016/5/13/chartex" xmlns:cx8="http://schemas.microsoft.com/office/drawing/2016/5/14/chartex" xmlns:mc="http://schemas.openxmlformats.org/markup-compatibility/2006" xmlns:aink="http://schemas.microsoft.com/office/drawing/2016/ink" xmlns:am3d="http://schemas.microsoft.com/office/drawing/2017/model3d" xmlns:o="urn:schemas-microsoft-com:office:office" xmlns:oel="http://schemas.microsoft.com/office/2019/extlst" xmlns:r="http://schemas.openxmlformats.org/officeDocument/2006/relationships" xmlns:m="http://schemas.openxmlformats.org/officeDocument/2006/math" xmlns:v="urn:schemas-microsoft-com:vml" xmlns:wp14="http://schemas.microsoft.com/office/word/2010/wordprocessingDrawing" xmlns:wp="http://schemas.openxmlformats.org/drawingml/2006/wordprocessingDrawing" xmlns:w10="urn:schemas-microsoft-com:office:word" xmlns:w="http://schemas.openxmlformats.org/wordprocessingml/2006/main" xmlns:w14="http://schemas.microsoft.com/office/word/2010/wordml" xmlns:w15="http://schemas.microsoft.com/office/word/2012/wordml" xmlns:w16cex="http://schemas.microsoft.com/office/word/2018/wordml/cex" xmlns:w16cid="http://schemas.microsoft.com/office/word/2016/wordml/cid" xmlns:w16="http://schemas.microsoft.com/office/word/2018/wordml" xmlns:w16du="http://schemas.microsoft.com/office/word/2023/wordml/word16du" xmlns:w16sdtdh="http://schemas.microsoft.com/office/word/2020/wordml/sdtdatahash" xmlns:w16sdtfl="http://schemas.microsoft.com/office/word/2024/wordml/sdtformatlock" xmlns:w16se="http://schemas.microsoft.com/office/word/2015/wordml/symex" xmlns:wpg="http://schemas.microsoft.com/office/word/2010/wordprocessingGroup" xmlns:wpi="http://schemas.microsoft.com/office/word/2010/wordprocessingInk" xmlns:wne="http://schemas.microsoft.com/office/word/2006/wordml" xmlns:wps="http://schemas.microsoft.com/office/word/2010/wordprocessingShape" mc:Ignorable="w14 w15 w16se w16cid w16 w16cex w16sdtdh w16sdtfl w16du wp14">
   <w:body>
     <w:p>
       <w:pPr>
@@ -1237,7 +1237,25 @@
                 <w:color w:val="000000"/>
                 <w:sz w:val="22"/>
               </w:rPr>
-              <w:t>List of Abbreviations and Terminologies…………………………………………………………..8</w:t>
+              <w:t>List of Abbreviations and Terminologies………………………………………………………</w:t>
+            </w:r>
+            <w:proofErr w:type="gramStart"/>
+            <w:r>
+              <w:rPr>
+                <w:rFonts w:asciiTheme="majorBidi" w:hAnsiTheme="majorBidi" w:cstheme="majorBidi"/>
+                <w:color w:val="000000"/>
+                <w:sz w:val="22"/>
+              </w:rPr>
+              <w:t>…..</w:t>
+            </w:r>
+            <w:proofErr w:type="gramEnd"/>
+            <w:r>
+              <w:rPr>
+                <w:rFonts w:asciiTheme="majorBidi" w:hAnsiTheme="majorBidi" w:cstheme="majorBidi"/>
+                <w:color w:val="000000"/>
+                <w:sz w:val="22"/>
+              </w:rPr>
+              <w:t>8</w:t>
             </w:r>
           </w:p>
           <w:p>
@@ -1309,7 +1327,16 @@
                 <w:color w:val="000000"/>
                 <w:sz w:val="22"/>
               </w:rPr>
-              <w:t>………………………………………………………………………...</w:t>
+              <w:t>………………………………………………………………………</w:t>
+            </w:r>
+            <w:proofErr w:type="gramStart"/>
+            <w:r>
+              <w:rPr>
+                <w:rFonts w:asciiTheme="majorBidi" w:hAnsiTheme="majorBidi" w:cstheme="majorBidi"/>
+                <w:color w:val="000000"/>
+                <w:sz w:val="22"/>
+              </w:rPr>
+              <w:t>...</w:t>
             </w:r>
             <w:r>
               <w:rPr>
@@ -1327,6 +1354,7 @@
               </w:rPr>
               <w:t>.</w:t>
             </w:r>
+            <w:proofErr w:type="gramEnd"/>
             <w:r>
               <w:rPr>
                 <w:rFonts w:asciiTheme="majorBidi" w:hAnsiTheme="majorBidi" w:cstheme="majorBidi"/>
@@ -2097,7 +2125,25 @@
                 <w:color w:val="000000"/>
                 <w:sz w:val="22"/>
               </w:rPr>
-              <w:t xml:space="preserve">       2.2.2 Project Plan……………………………………………………………………………..14</w:t>
+              <w:t xml:space="preserve">       2.2.2 Project Plan…………………………………………………………………………</w:t>
+            </w:r>
+            <w:proofErr w:type="gramStart"/>
+            <w:r>
+              <w:rPr>
+                <w:rFonts w:asciiTheme="majorBidi" w:hAnsiTheme="majorBidi" w:cstheme="majorBidi"/>
+                <w:color w:val="000000"/>
+                <w:sz w:val="22"/>
+              </w:rPr>
+              <w:t>…..</w:t>
+            </w:r>
+            <w:proofErr w:type="gramEnd"/>
+            <w:r>
+              <w:rPr>
+                <w:rFonts w:asciiTheme="majorBidi" w:hAnsiTheme="majorBidi" w:cstheme="majorBidi"/>
+                <w:color w:val="000000"/>
+                <w:sz w:val="22"/>
+              </w:rPr>
+              <w:t>14</w:t>
             </w:r>
           </w:p>
           <w:p>
@@ -2170,7 +2216,25 @@
                 <w:color w:val="000000"/>
                 <w:sz w:val="22"/>
               </w:rPr>
-              <w:t xml:space="preserve">      2.3.2 Analyzing and Validating Requirements………………………………………………..16</w:t>
+              <w:t xml:space="preserve">      2.3.2 Analyzing and Validating Requirements……………………………………………</w:t>
+            </w:r>
+            <w:proofErr w:type="gramStart"/>
+            <w:r>
+              <w:rPr>
+                <w:rFonts w:asciiTheme="majorBidi" w:hAnsiTheme="majorBidi" w:cstheme="majorBidi"/>
+                <w:color w:val="000000"/>
+                <w:sz w:val="22"/>
+              </w:rPr>
+              <w:t>…..</w:t>
+            </w:r>
+            <w:proofErr w:type="gramEnd"/>
+            <w:r>
+              <w:rPr>
+                <w:rFonts w:asciiTheme="majorBidi" w:hAnsiTheme="majorBidi" w:cstheme="majorBidi"/>
+                <w:color w:val="000000"/>
+                <w:sz w:val="22"/>
+              </w:rPr>
+              <w:t>16</w:t>
             </w:r>
           </w:p>
           <w:p>
@@ -4602,7 +4666,6 @@
             </w14:srgbClr>
           </w14:shadow>
         </w:rPr>
-        <w:lastRenderedPageBreak/>
         <w:t>ABSTRAC</w:t>
       </w:r>
       <w:r>
@@ -4892,7 +4955,27 @@
           <w:sz w:val="28"/>
           <w:szCs w:val="28"/>
         </w:rPr>
-        <w:t xml:space="preserve"> This project demonstrates significant potential to reduce administrative workload by up to 70%, eliminate traditional paper based procedures, and provide a user-friendly platform that addresses the specific needs of Jordanian higher education institutions. The system's compliance with ACID properties ensures data integrity while its scalability architecture supports future growth and expansion.</w:t>
+        <w:t xml:space="preserve"> This project demonstrates significant potential to reduce administrative workload by up to 70%, eliminate traditional </w:t>
+      </w:r>
+      <w:proofErr w:type="gramStart"/>
+      <w:r>
+        <w:rPr>
+          <w:rFonts w:asciiTheme="majorBidi" w:hAnsiTheme="majorBidi" w:cstheme="majorBidi"/>
+          <w:bCs/>
+          <w:sz w:val="28"/>
+          <w:szCs w:val="28"/>
+        </w:rPr>
+        <w:t>paper based</w:t>
+      </w:r>
+      <w:proofErr w:type="gramEnd"/>
+      <w:r>
+        <w:rPr>
+          <w:rFonts w:asciiTheme="majorBidi" w:hAnsiTheme="majorBidi" w:cstheme="majorBidi"/>
+          <w:bCs/>
+          <w:sz w:val="28"/>
+          <w:szCs w:val="28"/>
+        </w:rPr>
+        <w:t xml:space="preserve"> procedures, and provide a user-friendly platform that addresses the specific needs of Jordanian higher education institutions. The system's compliance with ACID properties ensures data integrity while its scalability architecture supports future growth and expansion.</w:t>
       </w:r>
     </w:p>
     <w:p>
@@ -5422,7 +5505,25 @@
           <w:sz w:val="28"/>
           <w:szCs w:val="28"/>
         </w:rPr>
-        <w:t>l the unified admission coordination unit forum to apply to public Jordanian universities. Once the student in accepted, students shall follow up the advertisements on the university website to find out dates of applying for admission. Afterwards, students must pursue procedures with the admission and registration unit for their username, password and e-payment number. After paying required fees, the student will fill their information through the self-registration website. Next, the student will attend proficiency exams and once they pass them, their schedule will be prepared within 2 hours based on the exams’ results. Finally the student’s university identity card will be issued by the deanship of student affairs [1].</w:t>
+        <w:t xml:space="preserve">l the unified admission coordination unit forum to apply to public Jordanian universities. Once the student in accepted, students shall follow up the advertisements on the university website to find out dates of applying for admission. Afterwards, students must pursue procedures with the admission and registration unit for their username, password and e-payment number. After paying required fees, the student will fill their information through the self-registration website. Next, the student will attend proficiency exams and once they pass them, their schedule will be prepared within 2 hours based on the exams’ results. </w:t>
+      </w:r>
+      <w:proofErr w:type="gramStart"/>
+      <w:r>
+        <w:rPr>
+          <w:rFonts w:asciiTheme="majorBidi" w:hAnsiTheme="majorBidi" w:cstheme="majorBidi"/>
+          <w:sz w:val="28"/>
+          <w:szCs w:val="28"/>
+        </w:rPr>
+        <w:t>Finally</w:t>
+      </w:r>
+      <w:proofErr w:type="gramEnd"/>
+      <w:r>
+        <w:rPr>
+          <w:rFonts w:asciiTheme="majorBidi" w:hAnsiTheme="majorBidi" w:cstheme="majorBidi"/>
+          <w:sz w:val="28"/>
+          <w:szCs w:val="28"/>
+        </w:rPr>
+        <w:t xml:space="preserve"> the student’s university identity card will be issued by the deanship of student affairs [1].</w:t>
       </w:r>
     </w:p>
     <w:p>
@@ -6332,7 +6433,27 @@
           <w:szCs w:val="28"/>
           <w:lang w:bidi="ar-JO"/>
         </w:rPr>
-        <w:t>The project’s main motivation is to reduce workload on administrative staff and eliminate the traditional paper-based registration procedures. Thus preventing students from lining up in long queues each semester. Also, the system will offer user-friendly interface which will encourage a larger number of students to register via the E-registration system.</w:t>
+        <w:t xml:space="preserve">The project’s main motivation is to reduce workload on administrative staff and eliminate the traditional paper-based registration procedures. </w:t>
+      </w:r>
+      <w:proofErr w:type="gramStart"/>
+      <w:r>
+        <w:rPr>
+          <w:rFonts w:asciiTheme="majorBidi" w:hAnsiTheme="majorBidi" w:cstheme="majorBidi"/>
+          <w:sz w:val="28"/>
+          <w:szCs w:val="28"/>
+          <w:lang w:bidi="ar-JO"/>
+        </w:rPr>
+        <w:t>Thus</w:t>
+      </w:r>
+      <w:proofErr w:type="gramEnd"/>
+      <w:r>
+        <w:rPr>
+          <w:rFonts w:asciiTheme="majorBidi" w:hAnsiTheme="majorBidi" w:cstheme="majorBidi"/>
+          <w:sz w:val="28"/>
+          <w:szCs w:val="28"/>
+          <w:lang w:bidi="ar-JO"/>
+        </w:rPr>
+        <w:t xml:space="preserve"> preventing students from lining up in long queues each semester. Also, the system will offer user-friendly interface which will encourage a larger number of students to register via the E-registration system.</w:t>
       </w:r>
     </w:p>
     <w:p>
@@ -6710,8 +6831,6 @@
               </w:rPr>
               <w:t>Admissions</w:t>
             </w:r>
-            <w:bookmarkStart w:id="0" w:name="_GoBack"/>
-            <w:bookmarkEnd w:id="0"/>
           </w:p>
         </w:tc>
         <w:tc>
@@ -8217,7 +8336,27 @@
           <w:szCs w:val="28"/>
           <w:lang w:bidi="ar-JO"/>
         </w:rPr>
-        <w:t>The system only requires basic web development skills, university IT department support, and open source frameworks.</w:t>
+        <w:t xml:space="preserve">The system only requires basic web development skills, university IT department support, and </w:t>
+      </w:r>
+      <w:proofErr w:type="gramStart"/>
+      <w:r>
+        <w:rPr>
+          <w:rFonts w:asciiTheme="majorBidi" w:hAnsiTheme="majorBidi" w:cstheme="majorBidi"/>
+          <w:sz w:val="28"/>
+          <w:szCs w:val="28"/>
+          <w:lang w:bidi="ar-JO"/>
+        </w:rPr>
+        <w:t>open source</w:t>
+      </w:r>
+      <w:proofErr w:type="gramEnd"/>
+      <w:r>
+        <w:rPr>
+          <w:rFonts w:asciiTheme="majorBidi" w:hAnsiTheme="majorBidi" w:cstheme="majorBidi"/>
+          <w:sz w:val="28"/>
+          <w:szCs w:val="28"/>
+          <w:lang w:bidi="ar-JO"/>
+        </w:rPr>
+        <w:t xml:space="preserve"> frameworks.</w:t>
       </w:r>
     </w:p>
     <w:p>
@@ -10439,7 +10578,23 @@
           <w:sz w:val="28"/>
           <w:szCs w:val="28"/>
         </w:rPr>
-        <w:t>send notifications to the instructors when any change to their timetables happen, to ensure that every instructor stays up to date.</w:t>
+        <w:t xml:space="preserve">send notifications to the instructors when any change to their timetables </w:t>
+      </w:r>
+      <w:r>
+        <w:rPr>
+          <w:rFonts w:asciiTheme="majorBidi" w:hAnsiTheme="majorBidi" w:cstheme="majorBidi"/>
+          <w:sz w:val="28"/>
+          <w:szCs w:val="28"/>
+        </w:rPr>
+        <w:t>happens</w:t>
+      </w:r>
+      <w:r>
+        <w:rPr>
+          <w:rFonts w:asciiTheme="majorBidi" w:hAnsiTheme="majorBidi" w:cstheme="majorBidi"/>
+          <w:sz w:val="28"/>
+          <w:szCs w:val="28"/>
+        </w:rPr>
+        <w:t>, to ensure that every instructor stays up to date.</w:t>
       </w:r>
     </w:p>
     <w:p>
@@ -12948,7 +13103,35 @@
           <w:sz w:val="24"/>
           <w:szCs w:val="24"/>
         </w:rPr>
-        <w:t>(n,d)</w:t>
+        <w:t>(</w:t>
+      </w:r>
+      <w:proofErr w:type="gramStart"/>
+      <w:r>
+        <w:rPr>
+          <w:rStyle w:val="Hyperlink"/>
+          <w:rFonts w:asciiTheme="majorBidi" w:hAnsiTheme="majorBidi" w:cstheme="majorBidi"/>
+          <w:b w:val="0"/>
+          <w:bCs w:val="0"/>
+          <w:i w:val="0"/>
+          <w:iCs w:val="0"/>
+          <w:sz w:val="24"/>
+          <w:szCs w:val="24"/>
+        </w:rPr>
+        <w:t>n,d</w:t>
+      </w:r>
+      <w:proofErr w:type="gramEnd"/>
+      <w:r>
+        <w:rPr>
+          <w:rStyle w:val="Hyperlink"/>
+          <w:rFonts w:asciiTheme="majorBidi" w:hAnsiTheme="majorBidi" w:cstheme="majorBidi"/>
+          <w:b w:val="0"/>
+          <w:bCs w:val="0"/>
+          <w:i w:val="0"/>
+          <w:iCs w:val="0"/>
+          <w:sz w:val="24"/>
+          <w:szCs w:val="24"/>
+        </w:rPr>
+        <w:t>)</w:t>
       </w:r>
     </w:p>
     <w:p>
@@ -12971,7 +13154,35 @@
           <w:rPr>
             <w:rStyle w:val="Hyperlink"/>
           </w:rPr>
-          <w:t>[2] Geeks for Geeks, What is the Project Environment?,  4 Mar, 2024</w:t>
+          <w:t xml:space="preserve">[2] Geeks for Geeks, </w:t>
+        </w:r>
+        <w:proofErr w:type="gramStart"/>
+        <w:r>
+          <w:rPr>
+            <w:rStyle w:val="Hyperlink"/>
+          </w:rPr>
+          <w:t>What</w:t>
+        </w:r>
+        <w:proofErr w:type="gramEnd"/>
+        <w:r>
+          <w:rPr>
+            <w:rStyle w:val="Hyperlink"/>
+          </w:rPr>
+          <w:t xml:space="preserve"> is the Project </w:t>
+        </w:r>
+        <w:proofErr w:type="gramStart"/>
+        <w:r>
+          <w:rPr>
+            <w:rStyle w:val="Hyperlink"/>
+          </w:rPr>
+          <w:t>Environment?,</w:t>
+        </w:r>
+        <w:proofErr w:type="gramEnd"/>
+        <w:r>
+          <w:rPr>
+            <w:rStyle w:val="Hyperlink"/>
+          </w:rPr>
+          <w:t xml:space="preserve">  4 Mar, 2024</w:t>
         </w:r>
       </w:hyperlink>
     </w:p>
@@ -12993,13 +13204,27 @@
         <w:rPr>
           <w:rFonts w:asciiTheme="majorBidi" w:hAnsiTheme="majorBidi" w:cstheme="majorBidi"/>
         </w:rPr>
-        <w:t>[3]</w:t>
-      </w:r>
-      <w:r>
-        <w:rPr>
-          <w:rFonts w:asciiTheme="majorBidi" w:hAnsiTheme="majorBidi" w:cstheme="majorBidi"/>
-        </w:rPr>
-        <w:t>Varela, Cristina, ed. Introduction to Software Engineering. 2nd ed. New York: 3G E-Learning, 2024.</w:t>
+        <w:t>[</w:t>
+      </w:r>
+      <w:proofErr w:type="gramStart"/>
+      <w:r>
+        <w:rPr>
+          <w:rFonts w:asciiTheme="majorBidi" w:hAnsiTheme="majorBidi" w:cstheme="majorBidi"/>
+        </w:rPr>
+        <w:t>3]</w:t>
+      </w:r>
+      <w:r>
+        <w:rPr>
+          <w:rFonts w:asciiTheme="majorBidi" w:hAnsiTheme="majorBidi" w:cstheme="majorBidi"/>
+        </w:rPr>
+        <w:t>Varela</w:t>
+      </w:r>
+      <w:proofErr w:type="gramEnd"/>
+      <w:r>
+        <w:rPr>
+          <w:rFonts w:asciiTheme="majorBidi" w:hAnsiTheme="majorBidi" w:cstheme="majorBidi"/>
+        </w:rPr>
+        <w:t>, Cristina, ed. Introduction to Software Engineering. 2nd ed. New York: 3G E-Learning, 2024.</w:t>
       </w:r>
     </w:p>
     <w:p>
@@ -13022,7 +13247,21 @@
           <w:rPr>
             <w:rStyle w:val="Hyperlink"/>
           </w:rPr>
-          <w:t>[4]Adobe for business, Project scope — definition, bes</w:t>
+          <w:t>[</w:t>
+        </w:r>
+        <w:proofErr w:type="gramStart"/>
+        <w:r>
+          <w:rPr>
+            <w:rStyle w:val="Hyperlink"/>
+          </w:rPr>
+          <w:t>4]Adobe</w:t>
+        </w:r>
+        <w:proofErr w:type="gramEnd"/>
+        <w:r>
+          <w:rPr>
+            <w:rStyle w:val="Hyperlink"/>
+          </w:rPr>
+          <w:t xml:space="preserve"> for business, Project scope — definition, bes</w:t>
         </w:r>
         <w:r>
           <w:rPr>
@@ -13050,6 +13289,7 @@
           </w:rPr>
           <w:t>[</w:t>
         </w:r>
+        <w:proofErr w:type="gramStart"/>
         <w:r>
           <w:rPr>
             <w:rStyle w:val="Hyperlink"/>
@@ -13060,7 +13300,14 @@
           <w:rPr>
             <w:rStyle w:val="Hyperlink"/>
           </w:rPr>
-          <w:t>]Stephanie Trovato, Work breakdown structure (WBS): definition, examples, steps, and templates [2026 guide], February 22, 2026</w:t>
+          <w:t>]Stephanie</w:t>
+        </w:r>
+        <w:proofErr w:type="gramEnd"/>
+        <w:r>
+          <w:rPr>
+            <w:rStyle w:val="Hyperlink"/>
+          </w:rPr>
+          <w:t xml:space="preserve"> Trovato, Work breakdown structure (WBS): definition, examples, steps, and templates [2026 guide], February 22, 2026</w:t>
         </w:r>
       </w:hyperlink>
     </w:p>
@@ -13083,7 +13330,21 @@
           <w:rPr>
             <w:rStyle w:val="Hyperlink"/>
           </w:rPr>
-          <w:t>[6]Sarah Laoyan, Waterfall project management methodology, phases, and guide, 5 September 2025.</w:t>
+          <w:t>[</w:t>
+        </w:r>
+        <w:proofErr w:type="gramStart"/>
+        <w:r>
+          <w:rPr>
+            <w:rStyle w:val="Hyperlink"/>
+          </w:rPr>
+          <w:t>6]Sarah</w:t>
+        </w:r>
+        <w:proofErr w:type="gramEnd"/>
+        <w:r>
+          <w:rPr>
+            <w:rStyle w:val="Hyperlink"/>
+          </w:rPr>
+          <w:t xml:space="preserve"> Laoyan, Waterfall project management methodology, phases, and guide, 5 September 2025.</w:t>
         </w:r>
       </w:hyperlink>
     </w:p>
@@ -13107,14 +13368,41 @@
           <w:rPr>
             <w:rStyle w:val="Hyperlink"/>
           </w:rPr>
-          <w:t xml:space="preserve">[7]Lucidchart, </w:t>
+          <w:t>[</w:t>
+        </w:r>
+        <w:proofErr w:type="gramStart"/>
+        <w:r>
+          <w:rPr>
+            <w:rStyle w:val="Hyperlink"/>
+          </w:rPr>
+          <w:t>7]Lucidchart</w:t>
+        </w:r>
+        <w:proofErr w:type="gramEnd"/>
+        <w:r>
+          <w:rPr>
+            <w:rStyle w:val="Hyperlink"/>
+          </w:rPr>
+          <w:t xml:space="preserve">, </w:t>
         </w:r>
         <w:r>
           <w:rPr>
             <w:rStyle w:val="Hyperlink"/>
           </w:rPr>
           <w:tab/>
-          <w:t>What is a Data Flow Diagram</w:t>
+        </w:r>
+        <w:proofErr w:type="gramStart"/>
+        <w:r>
+          <w:rPr>
+            <w:rStyle w:val="Hyperlink"/>
+          </w:rPr>
+          <w:t>What</w:t>
+        </w:r>
+        <w:proofErr w:type="gramEnd"/>
+        <w:r>
+          <w:rPr>
+            <w:rStyle w:val="Hyperlink"/>
+          </w:rPr>
+          <w:t xml:space="preserve"> is a Data Flow Diagram</w:t>
         </w:r>
         <w:r>
           <w:rPr>
@@ -13501,15 +13789,8 @@
 </w:document>
 </file>
 
-<file path=word/commentsIds.xml><?xml version="1.0" encoding="utf-8"?>
-<w16cid:commentsIds xmlns:wpc="http://schemas.microsoft.com/office/word/2010/wordprocessingCanvas" xmlns:cx="http://schemas.microsoft.com/office/drawing/2014/chartex" xmlns:cx1="http://schemas.microsoft.com/office/drawing/2015/9/8/chartex" xmlns:cx2="http://schemas.microsoft.com/office/drawing/2015/10/21/chartex" xmlns:cx3="http://schemas.microsoft.com/office/drawing/2016/5/9/chartex" xmlns:cx4="http://schemas.microsoft.com/office/drawing/2016/5/10/chartex" xmlns:cx5="http://schemas.microsoft.com/office/drawing/2016/5/11/chartex" xmlns:cx6="http://schemas.microsoft.com/office/drawing/2016/5/12/chartex" xmlns:cx7="http://schemas.microsoft.com/office/drawing/2016/5/13/chartex" xmlns:cx8="http://schemas.microsoft.com/office/drawing/2016/5/14/chartex" xmlns:mc="http://schemas.openxmlformats.org/markup-compatibility/2006" xmlns:aink="http://schemas.microsoft.com/office/drawing/2016/ink" xmlns:am3d="http://schemas.microsoft.com/office/drawing/2017/model3d" xmlns:o="urn:schemas-microsoft-com:office:office" xmlns:oel="http://schemas.microsoft.com/office/2019/extlst" xmlns:r="http://schemas.openxmlformats.org/officeDocument/2006/relationships" xmlns:m="http://schemas.openxmlformats.org/officeDocument/2006/math" xmlns:v="urn:schemas-microsoft-com:vml" xmlns:wp14="http://schemas.microsoft.com/office/word/2010/wordprocessingDrawing" xmlns:wp="http://schemas.openxmlformats.org/drawingml/2006/wordprocessingDrawing" xmlns:w10="urn:schemas-microsoft-com:office:word" xmlns:w="http://schemas.openxmlformats.org/wordprocessingml/2006/main" xmlns:w14="http://schemas.microsoft.com/office/word/2010/wordml" xmlns:w15="http://schemas.microsoft.com/office/word/2012/wordml" xmlns:w16cex="http://schemas.microsoft.com/office/word/2018/wordml/cex" xmlns:w16cid="http://schemas.microsoft.com/office/word/2016/wordml/cid" xmlns:w16="http://schemas.microsoft.com/office/word/2018/wordml" xmlns:w16du="http://schemas.microsoft.com/office/word/2023/wordml/word16du" xmlns:w16sdtdh="http://schemas.microsoft.com/office/word/2020/wordml/sdtdatahash" xmlns:w16sdtfl="http://schemas.microsoft.com/office/word/2024/wordml/sdtformatlock" xmlns:w16se="http://schemas.microsoft.com/office/word/2015/wordml/symex" xmlns:wpg="http://schemas.microsoft.com/office/word/2010/wordprocessingGroup" xmlns:wpi="http://schemas.microsoft.com/office/word/2010/wordprocessingInk" xmlns:wne="http://schemas.microsoft.com/office/word/2006/wordml" xmlns:wps="http://schemas.microsoft.com/office/word/2010/wordprocessingShape" mc:Ignorable="w14 w15 w16se w16cid w16 w16cex w16sdtdh w16sdtfl w16du wp14">
-  <w16cid:commentId w16cid:paraId="03BF9B3C" w16cid:durableId="22EBDCD0"/>
-  <w16cid:commentId w16cid:paraId="68B2F99A" w16cid:durableId="22EBDCD1"/>
-</w16cid:commentsIds>
-</file>
-
 <file path=word/endnotes.xml><?xml version="1.0" encoding="utf-8"?>
-<w:endnotes xmlns:wpc="http://schemas.microsoft.com/office/word/2010/wordprocessingCanvas" xmlns:mc="http://schemas.openxmlformats.org/markup-compatibility/2006" xmlns:o="urn:schemas-microsoft-com:office:office" xmlns:r="http://schemas.openxmlformats.org/officeDocument/2006/relationships" xmlns:m="http://schemas.openxmlformats.org/officeDocument/2006/math" xmlns:v="urn:schemas-microsoft-com:vml" xmlns:wp14="http://schemas.microsoft.com/office/word/2010/wordprocessingDrawing" xmlns:wp="http://schemas.openxmlformats.org/drawingml/2006/wordprocessingDrawing" xmlns:w10="urn:schemas-microsoft-com:office:word" xmlns:w="http://schemas.openxmlformats.org/wordprocessingml/2006/main" xmlns:w14="http://schemas.microsoft.com/office/word/2010/wordml" xmlns:w15="http://schemas.microsoft.com/office/word/2012/wordml" xmlns:wpg="http://schemas.microsoft.com/office/word/2010/wordprocessingGroup" xmlns:wpi="http://schemas.microsoft.com/office/word/2010/wordprocessingInk" xmlns:wne="http://schemas.microsoft.com/office/word/2006/wordml" xmlns:wps="http://schemas.microsoft.com/office/word/2010/wordprocessingShape" mc:Ignorable="w14 w15 wp14">
+<w:endnotes xmlns:wpc="http://schemas.microsoft.com/office/word/2010/wordprocessingCanvas" xmlns:cx="http://schemas.microsoft.com/office/drawing/2014/chartex" xmlns:cx1="http://schemas.microsoft.com/office/drawing/2015/9/8/chartex" xmlns:cx2="http://schemas.microsoft.com/office/drawing/2015/10/21/chartex" xmlns:cx3="http://schemas.microsoft.com/office/drawing/2016/5/9/chartex" xmlns:cx4="http://schemas.microsoft.com/office/drawing/2016/5/10/chartex" xmlns:cx5="http://schemas.microsoft.com/office/drawing/2016/5/11/chartex" xmlns:cx6="http://schemas.microsoft.com/office/drawing/2016/5/12/chartex" xmlns:cx7="http://schemas.microsoft.com/office/drawing/2016/5/13/chartex" xmlns:cx8="http://schemas.microsoft.com/office/drawing/2016/5/14/chartex" xmlns:mc="http://schemas.openxmlformats.org/markup-compatibility/2006" xmlns:aink="http://schemas.microsoft.com/office/drawing/2016/ink" xmlns:am3d="http://schemas.microsoft.com/office/drawing/2017/model3d" xmlns:o="urn:schemas-microsoft-com:office:office" xmlns:oel="http://schemas.microsoft.com/office/2019/extlst" xmlns:r="http://schemas.openxmlformats.org/officeDocument/2006/relationships" xmlns:m="http://schemas.openxmlformats.org/officeDocument/2006/math" xmlns:v="urn:schemas-microsoft-com:vml" xmlns:wp14="http://schemas.microsoft.com/office/word/2010/wordprocessingDrawing" xmlns:wp="http://schemas.openxmlformats.org/drawingml/2006/wordprocessingDrawing" xmlns:w10="urn:schemas-microsoft-com:office:word" xmlns:w="http://schemas.openxmlformats.org/wordprocessingml/2006/main" xmlns:w14="http://schemas.microsoft.com/office/word/2010/wordml" xmlns:w15="http://schemas.microsoft.com/office/word/2012/wordml" xmlns:w16cex="http://schemas.microsoft.com/office/word/2018/wordml/cex" xmlns:w16cid="http://schemas.microsoft.com/office/word/2016/wordml/cid" xmlns:w16="http://schemas.microsoft.com/office/word/2018/wordml" xmlns:w16du="http://schemas.microsoft.com/office/word/2023/wordml/word16du" xmlns:w16sdtdh="http://schemas.microsoft.com/office/word/2020/wordml/sdtdatahash" xmlns:w16sdtfl="http://schemas.microsoft.com/office/word/2024/wordml/sdtformatlock" xmlns:w16se="http://schemas.microsoft.com/office/word/2015/wordml/symex" xmlns:wpg="http://schemas.microsoft.com/office/word/2010/wordprocessingGroup" xmlns:wpi="http://schemas.microsoft.com/office/word/2010/wordprocessingInk" xmlns:wne="http://schemas.microsoft.com/office/word/2006/wordml" xmlns:wps="http://schemas.microsoft.com/office/word/2010/wordprocessingShape" mc:Ignorable="w14 w15 w16se w16cid w16 w16cex w16sdtdh w16sdtfl w16du wp14">
   <w:endnote w:type="separator" w:id="-1">
     <w:p>
       <w:r>
@@ -13528,7 +13809,7 @@
 </file>
 
 <file path=word/footnotes.xml><?xml version="1.0" encoding="utf-8"?>
-<w:footnotes xmlns:wpc="http://schemas.microsoft.com/office/word/2010/wordprocessingCanvas" xmlns:mc="http://schemas.openxmlformats.org/markup-compatibility/2006" xmlns:o="urn:schemas-microsoft-com:office:office" xmlns:r="http://schemas.openxmlformats.org/officeDocument/2006/relationships" xmlns:m="http://schemas.openxmlformats.org/officeDocument/2006/math" xmlns:v="urn:schemas-microsoft-com:vml" xmlns:wp14="http://schemas.microsoft.com/office/word/2010/wordprocessingDrawing" xmlns:wp="http://schemas.openxmlformats.org/drawingml/2006/wordprocessingDrawing" xmlns:w10="urn:schemas-microsoft-com:office:word" xmlns:w="http://schemas.openxmlformats.org/wordprocessingml/2006/main" xmlns:w14="http://schemas.microsoft.com/office/word/2010/wordml" xmlns:w15="http://schemas.microsoft.com/office/word/2012/wordml" xmlns:wpg="http://schemas.microsoft.com/office/word/2010/wordprocessingGroup" xmlns:wpi="http://schemas.microsoft.com/office/word/2010/wordprocessingInk" xmlns:wne="http://schemas.microsoft.com/office/word/2006/wordml" xmlns:wps="http://schemas.microsoft.com/office/word/2010/wordprocessingShape" mc:Ignorable="w14 w15 wp14">
+<w:footnotes xmlns:wpc="http://schemas.microsoft.com/office/word/2010/wordprocessingCanvas" xmlns:cx="http://schemas.microsoft.com/office/drawing/2014/chartex" xmlns:cx1="http://schemas.microsoft.com/office/drawing/2015/9/8/chartex" xmlns:cx2="http://schemas.microsoft.com/office/drawing/2015/10/21/chartex" xmlns:cx3="http://schemas.microsoft.com/office/drawing/2016/5/9/chartex" xmlns:cx4="http://schemas.microsoft.com/office/drawing/2016/5/10/chartex" xmlns:cx5="http://schemas.microsoft.com/office/drawing/2016/5/11/chartex" xmlns:cx6="http://schemas.microsoft.com/office/drawing/2016/5/12/chartex" xmlns:cx7="http://schemas.microsoft.com/office/drawing/2016/5/13/chartex" xmlns:cx8="http://schemas.microsoft.com/office/drawing/2016/5/14/chartex" xmlns:mc="http://schemas.openxmlformats.org/markup-compatibility/2006" xmlns:aink="http://schemas.microsoft.com/office/drawing/2016/ink" xmlns:am3d="http://schemas.microsoft.com/office/drawing/2017/model3d" xmlns:o="urn:schemas-microsoft-com:office:office" xmlns:oel="http://schemas.microsoft.com/office/2019/extlst" xmlns:r="http://schemas.openxmlformats.org/officeDocument/2006/relationships" xmlns:m="http://schemas.openxmlformats.org/officeDocument/2006/math" xmlns:v="urn:schemas-microsoft-com:vml" xmlns:wp14="http://schemas.microsoft.com/office/word/2010/wordprocessingDrawing" xmlns:wp="http://schemas.openxmlformats.org/drawingml/2006/wordprocessingDrawing" xmlns:w10="urn:schemas-microsoft-com:office:word" xmlns:w="http://schemas.openxmlformats.org/wordprocessingml/2006/main" xmlns:w14="http://schemas.microsoft.com/office/word/2010/wordml" xmlns:w15="http://schemas.microsoft.com/office/word/2012/wordml" xmlns:w16cex="http://schemas.microsoft.com/office/word/2018/wordml/cex" xmlns:w16cid="http://schemas.microsoft.com/office/word/2016/wordml/cid" xmlns:w16="http://schemas.microsoft.com/office/word/2018/wordml" xmlns:w16du="http://schemas.microsoft.com/office/word/2023/wordml/word16du" xmlns:w16sdtdh="http://schemas.microsoft.com/office/word/2020/wordml/sdtdatahash" xmlns:w16sdtfl="http://schemas.microsoft.com/office/word/2024/wordml/sdtformatlock" xmlns:w16se="http://schemas.microsoft.com/office/word/2015/wordml/symex" xmlns:wpg="http://schemas.microsoft.com/office/word/2010/wordprocessingGroup" xmlns:wpi="http://schemas.microsoft.com/office/word/2010/wordprocessingInk" xmlns:wne="http://schemas.microsoft.com/office/word/2006/wordml" xmlns:wps="http://schemas.microsoft.com/office/word/2010/wordprocessingShape" mc:Ignorable="w14 w15 w16se w16cid w16 w16cex w16sdtdh w16sdtfl w16du wp14">
   <w:footnote w:type="separator" w:id="-1">
     <w:p>
       <w:r>
@@ -13547,8 +13828,8 @@
 </file>
 
 <file path=word/numbering.xml><?xml version="1.0" encoding="utf-8"?>
-<w:numbering xmlns:wpc="http://schemas.microsoft.com/office/word/2010/wordprocessingCanvas" xmlns:mc="http://schemas.openxmlformats.org/markup-compatibility/2006" xmlns:o="urn:schemas-microsoft-com:office:office" xmlns:r="http://schemas.openxmlformats.org/officeDocument/2006/relationships" xmlns:m="http://schemas.openxmlformats.org/officeDocument/2006/math" xmlns:v="urn:schemas-microsoft-com:vml" xmlns:wp14="http://schemas.microsoft.com/office/word/2010/wordprocessingDrawing" xmlns:wp="http://schemas.openxmlformats.org/drawingml/2006/wordprocessingDrawing" xmlns:w10="urn:schemas-microsoft-com:office:word" xmlns:w="http://schemas.openxmlformats.org/wordprocessingml/2006/main" xmlns:w14="http://schemas.microsoft.com/office/word/2010/wordml" xmlns:w15="http://schemas.microsoft.com/office/word/2012/wordml" xmlns:wpg="http://schemas.microsoft.com/office/word/2010/wordprocessingGroup" xmlns:wpi="http://schemas.microsoft.com/office/word/2010/wordprocessingInk" xmlns:wne="http://schemas.microsoft.com/office/word/2006/wordml" xmlns:wps="http://schemas.microsoft.com/office/word/2010/wordprocessingShape" mc:Ignorable="w14 w15 wp14">
-  <w:abstractNum w:abstractNumId="0">
+<w:numbering xmlns:wpc="http://schemas.microsoft.com/office/word/2010/wordprocessingCanvas" xmlns:cx="http://schemas.microsoft.com/office/drawing/2014/chartex" xmlns:cx1="http://schemas.microsoft.com/office/drawing/2015/9/8/chartex" xmlns:cx2="http://schemas.microsoft.com/office/drawing/2015/10/21/chartex" xmlns:cx3="http://schemas.microsoft.com/office/drawing/2016/5/9/chartex" xmlns:cx4="http://schemas.microsoft.com/office/drawing/2016/5/10/chartex" xmlns:cx5="http://schemas.microsoft.com/office/drawing/2016/5/11/chartex" xmlns:cx6="http://schemas.microsoft.com/office/drawing/2016/5/12/chartex" xmlns:cx7="http://schemas.microsoft.com/office/drawing/2016/5/13/chartex" xmlns:cx8="http://schemas.microsoft.com/office/drawing/2016/5/14/chartex" xmlns:mc="http://schemas.openxmlformats.org/markup-compatibility/2006" xmlns:aink="http://schemas.microsoft.com/office/drawing/2016/ink" xmlns:am3d="http://schemas.microsoft.com/office/drawing/2017/model3d" xmlns:o="urn:schemas-microsoft-com:office:office" xmlns:oel="http://schemas.microsoft.com/office/2019/extlst" xmlns:r="http://schemas.openxmlformats.org/officeDocument/2006/relationships" xmlns:m="http://schemas.openxmlformats.org/officeDocument/2006/math" xmlns:v="urn:schemas-microsoft-com:vml" xmlns:wp14="http://schemas.microsoft.com/office/word/2010/wordprocessingDrawing" xmlns:wp="http://schemas.openxmlformats.org/drawingml/2006/wordprocessingDrawing" xmlns:w10="urn:schemas-microsoft-com:office:word" xmlns:w="http://schemas.openxmlformats.org/wordprocessingml/2006/main" xmlns:w14="http://schemas.microsoft.com/office/word/2010/wordml" xmlns:w15="http://schemas.microsoft.com/office/word/2012/wordml" xmlns:w16cex="http://schemas.microsoft.com/office/word/2018/wordml/cex" xmlns:w16cid="http://schemas.microsoft.com/office/word/2016/wordml/cid" xmlns:w16="http://schemas.microsoft.com/office/word/2018/wordml" xmlns:w16du="http://schemas.microsoft.com/office/word/2023/wordml/word16du" xmlns:w16sdtdh="http://schemas.microsoft.com/office/word/2020/wordml/sdtdatahash" xmlns:w16sdtfl="http://schemas.microsoft.com/office/word/2024/wordml/sdtformatlock" xmlns:w16se="http://schemas.microsoft.com/office/word/2015/wordml/symex" xmlns:wpg="http://schemas.microsoft.com/office/word/2010/wordprocessingGroup" xmlns:wpi="http://schemas.microsoft.com/office/word/2010/wordprocessingInk" xmlns:wne="http://schemas.microsoft.com/office/word/2006/wordml" xmlns:wps="http://schemas.microsoft.com/office/word/2010/wordprocessingShape" mc:Ignorable="w14 w15 w16se w16cid w16 w16cex w16sdtdh w16sdtfl w16du wp14">
+  <w:abstractNum w:abstractNumId="0" w15:restartNumberingAfterBreak="0">
     <w:nsid w:val="01E0287B"/>
     <w:multiLevelType w:val="hybridMultilevel"/>
     <w:tmpl w:val="6AF6E938"/>
@@ -13661,7 +13942,7 @@
       </w:rPr>
     </w:lvl>
   </w:abstractNum>
-  <w:abstractNum w:abstractNumId="1">
+  <w:abstractNum w:abstractNumId="1" w15:restartNumberingAfterBreak="0">
     <w:nsid w:val="0494593E"/>
     <w:multiLevelType w:val="hybridMultilevel"/>
     <w:tmpl w:val="5F8C10FA"/>
@@ -13750,7 +14031,7 @@
       </w:pPr>
     </w:lvl>
   </w:abstractNum>
-  <w:abstractNum w:abstractNumId="2">
+  <w:abstractNum w:abstractNumId="2" w15:restartNumberingAfterBreak="0">
     <w:nsid w:val="04FE2E48"/>
     <w:multiLevelType w:val="multilevel"/>
     <w:tmpl w:val="64883768"/>
@@ -13872,7 +14153,7 @@
       </w:rPr>
     </w:lvl>
   </w:abstractNum>
-  <w:abstractNum w:abstractNumId="3">
+  <w:abstractNum w:abstractNumId="3" w15:restartNumberingAfterBreak="0">
     <w:nsid w:val="085C57D2"/>
     <w:multiLevelType w:val="multilevel"/>
     <w:tmpl w:val="AC86FA94"/>
@@ -13994,7 +14275,7 @@
       </w:rPr>
     </w:lvl>
   </w:abstractNum>
-  <w:abstractNum w:abstractNumId="4">
+  <w:abstractNum w:abstractNumId="4" w15:restartNumberingAfterBreak="0">
     <w:nsid w:val="0FBD0658"/>
     <w:multiLevelType w:val="hybridMultilevel"/>
     <w:tmpl w:val="FABECEC8"/>
@@ -14083,7 +14364,7 @@
       </w:pPr>
     </w:lvl>
   </w:abstractNum>
-  <w:abstractNum w:abstractNumId="5">
+  <w:abstractNum w:abstractNumId="5" w15:restartNumberingAfterBreak="0">
     <w:nsid w:val="100C40F8"/>
     <w:multiLevelType w:val="hybridMultilevel"/>
     <w:tmpl w:val="140091A2"/>
@@ -14173,7 +14454,7 @@
       </w:pPr>
     </w:lvl>
   </w:abstractNum>
-  <w:abstractNum w:abstractNumId="6">
+  <w:abstractNum w:abstractNumId="6" w15:restartNumberingAfterBreak="0">
     <w:nsid w:val="10373572"/>
     <w:multiLevelType w:val="hybridMultilevel"/>
     <w:tmpl w:val="B936E22C"/>
@@ -14262,7 +14543,7 @@
       </w:pPr>
     </w:lvl>
   </w:abstractNum>
-  <w:abstractNum w:abstractNumId="7">
+  <w:abstractNum w:abstractNumId="7" w15:restartNumberingAfterBreak="0">
     <w:nsid w:val="10FF4B89"/>
     <w:multiLevelType w:val="hybridMultilevel"/>
     <w:tmpl w:val="C338E8D2"/>
@@ -14351,7 +14632,7 @@
       </w:pPr>
     </w:lvl>
   </w:abstractNum>
-  <w:abstractNum w:abstractNumId="8">
+  <w:abstractNum w:abstractNumId="8" w15:restartNumberingAfterBreak="0">
     <w:nsid w:val="120C788A"/>
     <w:multiLevelType w:val="hybridMultilevel"/>
     <w:tmpl w:val="28B2C0A4"/>
@@ -14464,7 +14745,7 @@
       </w:rPr>
     </w:lvl>
   </w:abstractNum>
-  <w:abstractNum w:abstractNumId="9">
+  <w:abstractNum w:abstractNumId="9" w15:restartNumberingAfterBreak="0">
     <w:nsid w:val="194D50CA"/>
     <w:multiLevelType w:val="hybridMultilevel"/>
     <w:tmpl w:val="152455F8"/>
@@ -14577,7 +14858,7 @@
       </w:rPr>
     </w:lvl>
   </w:abstractNum>
-  <w:abstractNum w:abstractNumId="10">
+  <w:abstractNum w:abstractNumId="10" w15:restartNumberingAfterBreak="0">
     <w:nsid w:val="1CA776E6"/>
     <w:multiLevelType w:val="hybridMultilevel"/>
     <w:tmpl w:val="439C10CE"/>
@@ -14690,7 +14971,7 @@
       </w:rPr>
     </w:lvl>
   </w:abstractNum>
-  <w:abstractNum w:abstractNumId="11">
+  <w:abstractNum w:abstractNumId="11" w15:restartNumberingAfterBreak="0">
     <w:nsid w:val="1CC26B03"/>
     <w:multiLevelType w:val="hybridMultilevel"/>
     <w:tmpl w:val="47E0DCB0"/>
@@ -14776,7 +15057,7 @@
       </w:pPr>
     </w:lvl>
   </w:abstractNum>
-  <w:abstractNum w:abstractNumId="12">
+  <w:abstractNum w:abstractNumId="12" w15:restartNumberingAfterBreak="0">
     <w:nsid w:val="219B7377"/>
     <w:multiLevelType w:val="multilevel"/>
     <w:tmpl w:val="DDB60C58"/>
@@ -14889,7 +15170,7 @@
       </w:rPr>
     </w:lvl>
   </w:abstractNum>
-  <w:abstractNum w:abstractNumId="13">
+  <w:abstractNum w:abstractNumId="13" w15:restartNumberingAfterBreak="0">
     <w:nsid w:val="22BA646F"/>
     <w:multiLevelType w:val="hybridMultilevel"/>
     <w:tmpl w:val="69ECE39E"/>
@@ -15002,7 +15283,7 @@
       </w:rPr>
     </w:lvl>
   </w:abstractNum>
-  <w:abstractNum w:abstractNumId="14">
+  <w:abstractNum w:abstractNumId="14" w15:restartNumberingAfterBreak="0">
     <w:nsid w:val="24231E4D"/>
     <w:multiLevelType w:val="hybridMultilevel"/>
     <w:tmpl w:val="4BF8D1AC"/>
@@ -15115,7 +15396,7 @@
       </w:rPr>
     </w:lvl>
   </w:abstractNum>
-  <w:abstractNum w:abstractNumId="15">
+  <w:abstractNum w:abstractNumId="15" w15:restartNumberingAfterBreak="0">
     <w:nsid w:val="26373363"/>
     <w:multiLevelType w:val="hybridMultilevel"/>
     <w:tmpl w:val="04F0D7BC"/>
@@ -15204,7 +15485,7 @@
       </w:pPr>
     </w:lvl>
   </w:abstractNum>
-  <w:abstractNum w:abstractNumId="16">
+  <w:abstractNum w:abstractNumId="16" w15:restartNumberingAfterBreak="0">
     <w:nsid w:val="2B38308F"/>
     <w:multiLevelType w:val="hybridMultilevel"/>
     <w:tmpl w:val="9E4414BE"/>
@@ -15293,7 +15574,7 @@
       </w:pPr>
     </w:lvl>
   </w:abstractNum>
-  <w:abstractNum w:abstractNumId="17">
+  <w:abstractNum w:abstractNumId="17" w15:restartNumberingAfterBreak="0">
     <w:nsid w:val="2C753C85"/>
     <w:multiLevelType w:val="hybridMultilevel"/>
     <w:tmpl w:val="DE223D6E"/>
@@ -15406,7 +15687,7 @@
       </w:rPr>
     </w:lvl>
   </w:abstractNum>
-  <w:abstractNum w:abstractNumId="18">
+  <w:abstractNum w:abstractNumId="18" w15:restartNumberingAfterBreak="0">
     <w:nsid w:val="2F3369B8"/>
     <w:multiLevelType w:val="hybridMultilevel"/>
     <w:tmpl w:val="1D186204"/>
@@ -15495,7 +15776,7 @@
       </w:pPr>
     </w:lvl>
   </w:abstractNum>
-  <w:abstractNum w:abstractNumId="19">
+  <w:abstractNum w:abstractNumId="19" w15:restartNumberingAfterBreak="0">
     <w:nsid w:val="35C20D03"/>
     <w:multiLevelType w:val="hybridMultilevel"/>
     <w:tmpl w:val="D4682134"/>
@@ -15584,7 +15865,7 @@
       </w:pPr>
     </w:lvl>
   </w:abstractNum>
-  <w:abstractNum w:abstractNumId="20">
+  <w:abstractNum w:abstractNumId="20" w15:restartNumberingAfterBreak="0">
     <w:nsid w:val="35E72175"/>
     <w:multiLevelType w:val="hybridMultilevel"/>
     <w:tmpl w:val="828A48C2"/>
@@ -15700,7 +15981,7 @@
       </w:pPr>
     </w:lvl>
   </w:abstractNum>
-  <w:abstractNum w:abstractNumId="21">
+  <w:abstractNum w:abstractNumId="21" w15:restartNumberingAfterBreak="0">
     <w:nsid w:val="36F10AB1"/>
     <w:multiLevelType w:val="hybridMultilevel"/>
     <w:tmpl w:val="D534C796"/>
@@ -15813,7 +16094,7 @@
       </w:rPr>
     </w:lvl>
   </w:abstractNum>
-  <w:abstractNum w:abstractNumId="22">
+  <w:abstractNum w:abstractNumId="22" w15:restartNumberingAfterBreak="0">
     <w:nsid w:val="3AE4752F"/>
     <w:multiLevelType w:val="hybridMultilevel"/>
     <w:tmpl w:val="D2000510"/>
@@ -15902,7 +16183,7 @@
       </w:pPr>
     </w:lvl>
   </w:abstractNum>
-  <w:abstractNum w:abstractNumId="23">
+  <w:abstractNum w:abstractNumId="23" w15:restartNumberingAfterBreak="0">
     <w:nsid w:val="3C0D6FDF"/>
     <w:multiLevelType w:val="hybridMultilevel"/>
     <w:tmpl w:val="829E7F60"/>
@@ -15991,7 +16272,7 @@
       </w:pPr>
     </w:lvl>
   </w:abstractNum>
-  <w:abstractNum w:abstractNumId="24">
+  <w:abstractNum w:abstractNumId="24" w15:restartNumberingAfterBreak="0">
     <w:nsid w:val="3C2E0203"/>
     <w:multiLevelType w:val="hybridMultilevel"/>
     <w:tmpl w:val="9A16D576"/>
@@ -16104,7 +16385,7 @@
       </w:rPr>
     </w:lvl>
   </w:abstractNum>
-  <w:abstractNum w:abstractNumId="25">
+  <w:abstractNum w:abstractNumId="25" w15:restartNumberingAfterBreak="0">
     <w:nsid w:val="3D0D65BF"/>
     <w:multiLevelType w:val="hybridMultilevel"/>
     <w:tmpl w:val="E540815A"/>
@@ -16193,7 +16474,7 @@
       </w:pPr>
     </w:lvl>
   </w:abstractNum>
-  <w:abstractNum w:abstractNumId="26">
+  <w:abstractNum w:abstractNumId="26" w15:restartNumberingAfterBreak="0">
     <w:nsid w:val="3EAD269F"/>
     <w:multiLevelType w:val="hybridMultilevel"/>
     <w:tmpl w:val="DC0411F0"/>
@@ -16282,7 +16563,7 @@
       </w:pPr>
     </w:lvl>
   </w:abstractNum>
-  <w:abstractNum w:abstractNumId="27">
+  <w:abstractNum w:abstractNumId="27" w15:restartNumberingAfterBreak="0">
     <w:nsid w:val="3FEF00BA"/>
     <w:multiLevelType w:val="hybridMultilevel"/>
     <w:tmpl w:val="2AE03C08"/>
@@ -16371,7 +16652,7 @@
       </w:pPr>
     </w:lvl>
   </w:abstractNum>
-  <w:abstractNum w:abstractNumId="28">
+  <w:abstractNum w:abstractNumId="28" w15:restartNumberingAfterBreak="0">
     <w:nsid w:val="40030475"/>
     <w:multiLevelType w:val="hybridMultilevel"/>
     <w:tmpl w:val="324AACE8"/>
@@ -16461,7 +16742,7 @@
       </w:pPr>
     </w:lvl>
   </w:abstractNum>
-  <w:abstractNum w:abstractNumId="29">
+  <w:abstractNum w:abstractNumId="29" w15:restartNumberingAfterBreak="0">
     <w:nsid w:val="40F24670"/>
     <w:multiLevelType w:val="hybridMultilevel"/>
     <w:tmpl w:val="0E4E0280"/>
@@ -16550,7 +16831,7 @@
       </w:pPr>
     </w:lvl>
   </w:abstractNum>
-  <w:abstractNum w:abstractNumId="30">
+  <w:abstractNum w:abstractNumId="30" w15:restartNumberingAfterBreak="0">
     <w:nsid w:val="43B124B7"/>
     <w:multiLevelType w:val="hybridMultilevel"/>
     <w:tmpl w:val="915C2112"/>
@@ -16639,7 +16920,7 @@
       </w:pPr>
     </w:lvl>
   </w:abstractNum>
-  <w:abstractNum w:abstractNumId="31">
+  <w:abstractNum w:abstractNumId="31" w15:restartNumberingAfterBreak="0">
     <w:nsid w:val="54062044"/>
     <w:multiLevelType w:val="hybridMultilevel"/>
     <w:tmpl w:val="0A98B730"/>
@@ -16728,7 +17009,7 @@
       </w:pPr>
     </w:lvl>
   </w:abstractNum>
-  <w:abstractNum w:abstractNumId="32">
+  <w:abstractNum w:abstractNumId="32" w15:restartNumberingAfterBreak="0">
     <w:nsid w:val="56A37442"/>
     <w:multiLevelType w:val="hybridMultilevel"/>
     <w:tmpl w:val="B9DA918E"/>
@@ -16844,7 +17125,7 @@
       </w:pPr>
     </w:lvl>
   </w:abstractNum>
-  <w:abstractNum w:abstractNumId="33">
+  <w:abstractNum w:abstractNumId="33" w15:restartNumberingAfterBreak="0">
     <w:nsid w:val="5DC33C1D"/>
     <w:multiLevelType w:val="multilevel"/>
     <w:tmpl w:val="D840B09C"/>
@@ -16957,7 +17238,7 @@
       </w:rPr>
     </w:lvl>
   </w:abstractNum>
-  <w:abstractNum w:abstractNumId="34">
+  <w:abstractNum w:abstractNumId="34" w15:restartNumberingAfterBreak="0">
     <w:nsid w:val="5EB2174A"/>
     <w:multiLevelType w:val="hybridMultilevel"/>
     <w:tmpl w:val="3E84B58C"/>
@@ -17070,7 +17351,7 @@
       </w:rPr>
     </w:lvl>
   </w:abstractNum>
-  <w:abstractNum w:abstractNumId="35">
+  <w:abstractNum w:abstractNumId="35" w15:restartNumberingAfterBreak="0">
     <w:nsid w:val="67D06766"/>
     <w:multiLevelType w:val="hybridMultilevel"/>
     <w:tmpl w:val="39004620"/>
@@ -17160,7 +17441,7 @@
       </w:pPr>
     </w:lvl>
   </w:abstractNum>
-  <w:abstractNum w:abstractNumId="36">
+  <w:abstractNum w:abstractNumId="36" w15:restartNumberingAfterBreak="0">
     <w:nsid w:val="6C0E2E26"/>
     <w:multiLevelType w:val="hybridMultilevel"/>
     <w:tmpl w:val="E04071F2"/>
@@ -17249,7 +17530,7 @@
       </w:pPr>
     </w:lvl>
   </w:abstractNum>
-  <w:abstractNum w:abstractNumId="37">
+  <w:abstractNum w:abstractNumId="37" w15:restartNumberingAfterBreak="0">
     <w:nsid w:val="6FC06E60"/>
     <w:multiLevelType w:val="hybridMultilevel"/>
     <w:tmpl w:val="903A7AA0"/>
@@ -17338,7 +17619,7 @@
       </w:pPr>
     </w:lvl>
   </w:abstractNum>
-  <w:abstractNum w:abstractNumId="38">
+  <w:abstractNum w:abstractNumId="38" w15:restartNumberingAfterBreak="0">
     <w:nsid w:val="78861115"/>
     <w:multiLevelType w:val="hybridMultilevel"/>
     <w:tmpl w:val="4E5CB6A8"/>
@@ -17427,7 +17708,7 @@
       </w:pPr>
     </w:lvl>
   </w:abstractNum>
-  <w:abstractNum w:abstractNumId="39">
+  <w:abstractNum w:abstractNumId="39" w15:restartNumberingAfterBreak="0">
     <w:nsid w:val="7BD020C9"/>
     <w:multiLevelType w:val="hybridMultilevel"/>
     <w:tmpl w:val="10561686"/>
@@ -17540,124 +17821,124 @@
       </w:rPr>
     </w:lvl>
   </w:abstractNum>
-  <w:num w:numId="1">
+  <w:num w:numId="1" w16cid:durableId="104732036">
     <w:abstractNumId w:val="32"/>
   </w:num>
-  <w:num w:numId="2">
+  <w:num w:numId="2" w16cid:durableId="2071267269">
     <w:abstractNumId w:val="20"/>
   </w:num>
-  <w:num w:numId="3">
+  <w:num w:numId="3" w16cid:durableId="159471443">
     <w:abstractNumId w:val="33"/>
   </w:num>
-  <w:num w:numId="4">
+  <w:num w:numId="4" w16cid:durableId="980306136">
     <w:abstractNumId w:val="12"/>
   </w:num>
-  <w:num w:numId="5">
+  <w:num w:numId="5" w16cid:durableId="446966633">
     <w:abstractNumId w:val="26"/>
   </w:num>
-  <w:num w:numId="6">
+  <w:num w:numId="6" w16cid:durableId="722022805">
     <w:abstractNumId w:val="22"/>
   </w:num>
-  <w:num w:numId="7">
+  <w:num w:numId="7" w16cid:durableId="1431245133">
     <w:abstractNumId w:val="5"/>
   </w:num>
-  <w:num w:numId="8">
+  <w:num w:numId="8" w16cid:durableId="2139254082">
     <w:abstractNumId w:val="18"/>
   </w:num>
-  <w:num w:numId="9">
+  <w:num w:numId="9" w16cid:durableId="242494581">
     <w:abstractNumId w:val="6"/>
   </w:num>
-  <w:num w:numId="10">
+  <w:num w:numId="10" w16cid:durableId="659620146">
     <w:abstractNumId w:val="9"/>
   </w:num>
-  <w:num w:numId="11">
+  <w:num w:numId="11" w16cid:durableId="1308047836">
     <w:abstractNumId w:val="21"/>
   </w:num>
-  <w:num w:numId="12">
+  <w:num w:numId="12" w16cid:durableId="617688783">
     <w:abstractNumId w:val="10"/>
   </w:num>
-  <w:num w:numId="13">
+  <w:num w:numId="13" w16cid:durableId="116804796">
     <w:abstractNumId w:val="17"/>
   </w:num>
-  <w:num w:numId="14">
+  <w:num w:numId="14" w16cid:durableId="1120415740">
     <w:abstractNumId w:val="34"/>
   </w:num>
-  <w:num w:numId="15">
+  <w:num w:numId="15" w16cid:durableId="628365506">
     <w:abstractNumId w:val="28"/>
   </w:num>
-  <w:num w:numId="16">
+  <w:num w:numId="16" w16cid:durableId="971594771">
     <w:abstractNumId w:val="3"/>
   </w:num>
-  <w:num w:numId="17">
+  <w:num w:numId="17" w16cid:durableId="1877085955">
     <w:abstractNumId w:val="36"/>
   </w:num>
-  <w:num w:numId="18">
+  <w:num w:numId="18" w16cid:durableId="2039819962">
     <w:abstractNumId w:val="14"/>
   </w:num>
-  <w:num w:numId="19">
+  <w:num w:numId="19" w16cid:durableId="275673746">
     <w:abstractNumId w:val="0"/>
   </w:num>
-  <w:num w:numId="20">
+  <w:num w:numId="20" w16cid:durableId="905803978">
     <w:abstractNumId w:val="11"/>
   </w:num>
-  <w:num w:numId="21">
+  <w:num w:numId="21" w16cid:durableId="54816308">
     <w:abstractNumId w:val="25"/>
   </w:num>
-  <w:num w:numId="22">
+  <w:num w:numId="22" w16cid:durableId="262691086">
     <w:abstractNumId w:val="30"/>
   </w:num>
-  <w:num w:numId="23">
+  <w:num w:numId="23" w16cid:durableId="428425645">
     <w:abstractNumId w:val="37"/>
   </w:num>
-  <w:num w:numId="24">
+  <w:num w:numId="24" w16cid:durableId="994917989">
     <w:abstractNumId w:val="38"/>
   </w:num>
-  <w:num w:numId="25">
+  <w:num w:numId="25" w16cid:durableId="427579754">
     <w:abstractNumId w:val="29"/>
   </w:num>
-  <w:num w:numId="26">
+  <w:num w:numId="26" w16cid:durableId="617951063">
     <w:abstractNumId w:val="2"/>
   </w:num>
-  <w:num w:numId="27">
+  <w:num w:numId="27" w16cid:durableId="1080365772">
     <w:abstractNumId w:val="16"/>
   </w:num>
-  <w:num w:numId="28">
+  <w:num w:numId="28" w16cid:durableId="1903981234">
     <w:abstractNumId w:val="31"/>
   </w:num>
-  <w:num w:numId="29">
+  <w:num w:numId="29" w16cid:durableId="1741172356">
     <w:abstractNumId w:val="19"/>
   </w:num>
-  <w:num w:numId="30">
+  <w:num w:numId="30" w16cid:durableId="1413813085">
     <w:abstractNumId w:val="15"/>
   </w:num>
-  <w:num w:numId="31">
+  <w:num w:numId="31" w16cid:durableId="1628318133">
     <w:abstractNumId w:val="23"/>
   </w:num>
-  <w:num w:numId="32">
+  <w:num w:numId="32" w16cid:durableId="704671379">
     <w:abstractNumId w:val="4"/>
   </w:num>
-  <w:num w:numId="33">
+  <w:num w:numId="33" w16cid:durableId="47656995">
     <w:abstractNumId w:val="7"/>
   </w:num>
-  <w:num w:numId="34">
+  <w:num w:numId="34" w16cid:durableId="1194028383">
     <w:abstractNumId w:val="1"/>
   </w:num>
-  <w:num w:numId="35">
+  <w:num w:numId="35" w16cid:durableId="1595093118">
     <w:abstractNumId w:val="27"/>
   </w:num>
-  <w:num w:numId="36">
+  <w:num w:numId="36" w16cid:durableId="1855487879">
     <w:abstractNumId w:val="24"/>
   </w:num>
-  <w:num w:numId="37">
+  <w:num w:numId="37" w16cid:durableId="684677500">
     <w:abstractNumId w:val="8"/>
   </w:num>
-  <w:num w:numId="38">
+  <w:num w:numId="38" w16cid:durableId="1951860218">
     <w:abstractNumId w:val="39"/>
   </w:num>
-  <w:num w:numId="39">
+  <w:num w:numId="39" w16cid:durableId="203442147">
     <w:abstractNumId w:val="35"/>
   </w:num>
-  <w:num w:numId="40">
+  <w:num w:numId="40" w16cid:durableId="1927303120">
     <w:abstractNumId w:val="13"/>
   </w:num>
   <w:numIdMacAtCleanup w:val="28"/>
@@ -17665,7 +17946,7 @@
 </file>
 
 <file path=word/styles.xml><?xml version="1.0" encoding="utf-8"?>
-<w:styles xmlns:mc="http://schemas.openxmlformats.org/markup-compatibility/2006" xmlns:r="http://schemas.openxmlformats.org/officeDocument/2006/relationships" xmlns:w="http://schemas.openxmlformats.org/wordprocessingml/2006/main" xmlns:w14="http://schemas.microsoft.com/office/word/2010/wordml" xmlns:w15="http://schemas.microsoft.com/office/word/2012/wordml" mc:Ignorable="w14 w15">
+<w:styles xmlns:mc="http://schemas.openxmlformats.org/markup-compatibility/2006" xmlns:r="http://schemas.openxmlformats.org/officeDocument/2006/relationships" xmlns:w="http://schemas.openxmlformats.org/wordprocessingml/2006/main" xmlns:w14="http://schemas.microsoft.com/office/word/2010/wordml" xmlns:w15="http://schemas.microsoft.com/office/word/2012/wordml" xmlns:w16cex="http://schemas.microsoft.com/office/word/2018/wordml/cex" xmlns:w16cid="http://schemas.microsoft.com/office/word/2016/wordml/cid" xmlns:w16="http://schemas.microsoft.com/office/word/2018/wordml" xmlns:w16du="http://schemas.microsoft.com/office/word/2023/wordml/word16du" xmlns:w16sdtdh="http://schemas.microsoft.com/office/word/2020/wordml/sdtdatahash" xmlns:w16sdtfl="http://schemas.microsoft.com/office/word/2024/wordml/sdtformatlock" xmlns:w16se="http://schemas.microsoft.com/office/word/2015/wordml/symex" mc:Ignorable="w14 w15 w16se w16cid w16 w16cex w16sdtdh w16sdtfl w16du">
   <w:docDefaults>
     <w:rPrDefault>
       <w:rPr>
@@ -17675,7 +17956,7 @@
     </w:rPrDefault>
     <w:pPrDefault/>
   </w:docDefaults>
-  <w:latentStyles w:defLockedState="0" w:defUIPriority="0" w:defSemiHidden="0" w:defUnhideWhenUsed="0" w:defQFormat="0" w:count="371">
+  <w:latentStyles w:defLockedState="0" w:defUIPriority="0" w:defSemiHidden="0" w:defUnhideWhenUsed="0" w:defQFormat="0" w:count="376">
     <w:lsdException w:name="Normal" w:qFormat="1"/>
     <w:lsdException w:name="heading 1" w:qFormat="1"/>
     <w:lsdException w:name="heading 2" w:qFormat="1"/>
@@ -18040,6 +18321,11 @@
     <w:lsdException w:name="List Table 5 Dark Accent 6" w:uiPriority="50"/>
     <w:lsdException w:name="List Table 6 Colorful Accent 6" w:uiPriority="51"/>
     <w:lsdException w:name="List Table 7 Colorful Accent 6" w:uiPriority="52"/>
+    <w:lsdException w:name="Mention" w:semiHidden="1" w:uiPriority="99" w:unhideWhenUsed="1"/>
+    <w:lsdException w:name="Smart Hyperlink" w:semiHidden="1" w:uiPriority="99" w:unhideWhenUsed="1"/>
+    <w:lsdException w:name="Hashtag" w:semiHidden="1" w:uiPriority="99" w:unhideWhenUsed="1"/>
+    <w:lsdException w:name="Unresolved Mention" w:semiHidden="1" w:uiPriority="99" w:unhideWhenUsed="1"/>
+    <w:lsdException w:name="Smart Link" w:semiHidden="1" w:uiPriority="99" w:unhideWhenUsed="1"/>
   </w:latentStyles>
   <w:style w:type="paragraph" w:default="1" w:styleId="Normal">
     <w:name w:val="Normal"/>
@@ -18261,7 +18547,6 @@
       <w:rFonts w:eastAsia="Times New Roman"/>
     </w:rPr>
     <w:tblPr>
-      <w:tblInd w:w="0" w:type="dxa"/>
       <w:tblBorders>
         <w:top w:val="single" w:sz="4" w:space="0" w:color="auto"/>
         <w:left w:val="single" w:sz="4" w:space="0" w:color="auto"/>
@@ -18270,12 +18555,6 @@
         <w:insideH w:val="single" w:sz="4" w:space="0" w:color="auto"/>
         <w:insideV w:val="single" w:sz="4" w:space="0" w:color="auto"/>
       </w:tblBorders>
-      <w:tblCellMar>
-        <w:top w:w="0" w:type="dxa"/>
-        <w:left w:w="108" w:type="dxa"/>
-        <w:bottom w:w="0" w:type="dxa"/>
-        <w:right w:w="108" w:type="dxa"/>
-      </w:tblCellMar>
     </w:tblPr>
   </w:style>
   <w:style w:type="character" w:customStyle="1" w:styleId="Heading5Char">

</xml_diff>